<commit_message>
Board.py QA Test Cont.
Tested populateBoard() and setState() to confirm functionality. Created a test program to do so.
</commit_message>
<xml_diff>
--- a/docs/Artifacts/Testing/EECS581 Minesweeper Board.py Test Cases.docx
+++ b/docs/Artifacts/Testing/EECS581 Minesweeper Board.py Test Cases.docx
@@ -14,8 +14,29 @@
       <w:pPr>
         <w:pStyle w:val="Heading2"/>
       </w:pPr>
-      <w:r>
-        <w:t>populateBoard(clickedCellRow: int, clickedCellCol: int)</w:t>
+      <w:proofErr w:type="spellStart"/>
+      <w:r>
+        <w:t>populateBoard</w:t>
+      </w:r>
+      <w:proofErr w:type="spellEnd"/>
+      <w:r>
+        <w:t>(</w:t>
+      </w:r>
+      <w:proofErr w:type="spellStart"/>
+      <w:r>
+        <w:t>clickedCellRow</w:t>
+      </w:r>
+      <w:proofErr w:type="spellEnd"/>
+      <w:r>
+        <w:t xml:space="preserve">: int, </w:t>
+      </w:r>
+      <w:proofErr w:type="spellStart"/>
+      <w:r>
+        <w:t>clickedCellCol</w:t>
+      </w:r>
+      <w:proofErr w:type="spellEnd"/>
+      <w:r>
+        <w:t>: int)</w:t>
       </w:r>
     </w:p>
     <w:p>
@@ -82,13 +103,47 @@
           <w:szCs w:val="28"/>
         </w:rPr>
       </w:pPr>
-      <w:r>
-        <w:rPr>
-          <w:sz w:val="28"/>
-          <w:szCs w:val="28"/>
-        </w:rPr>
-        <w:t>rowMine == clickedCellRow and coalmine == clickedCellCol</w:t>
-      </w:r>
+      <w:proofErr w:type="spellStart"/>
+      <w:r>
+        <w:rPr>
+          <w:sz w:val="28"/>
+          <w:szCs w:val="28"/>
+        </w:rPr>
+        <w:t>rowMine</w:t>
+      </w:r>
+      <w:proofErr w:type="spellEnd"/>
+      <w:r>
+        <w:rPr>
+          <w:sz w:val="28"/>
+          <w:szCs w:val="28"/>
+        </w:rPr>
+        <w:t xml:space="preserve"> == </w:t>
+      </w:r>
+      <w:proofErr w:type="spellStart"/>
+      <w:r>
+        <w:rPr>
+          <w:sz w:val="28"/>
+          <w:szCs w:val="28"/>
+        </w:rPr>
+        <w:t>clickedCellRow</w:t>
+      </w:r>
+      <w:proofErr w:type="spellEnd"/>
+      <w:r>
+        <w:rPr>
+          <w:sz w:val="28"/>
+          <w:szCs w:val="28"/>
+        </w:rPr>
+        <w:t xml:space="preserve"> and coalmine == </w:t>
+      </w:r>
+      <w:proofErr w:type="spellStart"/>
+      <w:r>
+        <w:rPr>
+          <w:sz w:val="28"/>
+          <w:szCs w:val="28"/>
+        </w:rPr>
+        <w:t>clickedCellCol</w:t>
+      </w:r>
+      <w:proofErr w:type="spellEnd"/>
     </w:p>
     <w:p>
       <w:pPr>
@@ -176,6 +231,13 @@
         </w:rPr>
         <w:t xml:space="preserve">Observed Behavior: </w:t>
       </w:r>
+      <w:r>
+        <w:rPr>
+          <w:sz w:val="28"/>
+          <w:szCs w:val="28"/>
+        </w:rPr>
+        <w:t>Same as expected behavior</w:t>
+      </w:r>
     </w:p>
     <w:p>
       <w:pPr>
@@ -189,12 +251,53 @@
           <w:szCs w:val="28"/>
         </w:rPr>
       </w:pPr>
-      <w:r>
-        <w:rPr>
-          <w:sz w:val="28"/>
-          <w:szCs w:val="28"/>
-        </w:rPr>
-        <w:t>self.getCellState(clickedCellRow, clickedCellCol) == 3</w:t>
+      <w:proofErr w:type="spellStart"/>
+      <w:r>
+        <w:rPr>
+          <w:sz w:val="28"/>
+          <w:szCs w:val="28"/>
+        </w:rPr>
+        <w:t>self.getCellState</w:t>
+      </w:r>
+      <w:proofErr w:type="spellEnd"/>
+      <w:r>
+        <w:rPr>
+          <w:sz w:val="28"/>
+          <w:szCs w:val="28"/>
+        </w:rPr>
+        <w:t>(</w:t>
+      </w:r>
+      <w:proofErr w:type="spellStart"/>
+      <w:r>
+        <w:rPr>
+          <w:sz w:val="28"/>
+          <w:szCs w:val="28"/>
+        </w:rPr>
+        <w:t>clickedCellRow</w:t>
+      </w:r>
+      <w:proofErr w:type="spellEnd"/>
+      <w:r>
+        <w:rPr>
+          <w:sz w:val="28"/>
+          <w:szCs w:val="28"/>
+        </w:rPr>
+        <w:t xml:space="preserve">, </w:t>
+      </w:r>
+      <w:proofErr w:type="spellStart"/>
+      <w:r>
+        <w:rPr>
+          <w:sz w:val="28"/>
+          <w:szCs w:val="28"/>
+        </w:rPr>
+        <w:t>clickedCellCol</w:t>
+      </w:r>
+      <w:proofErr w:type="spellEnd"/>
+      <w:r>
+        <w:rPr>
+          <w:sz w:val="28"/>
+          <w:szCs w:val="28"/>
+        </w:rPr>
+        <w:t>) == 3</w:t>
       </w:r>
     </w:p>
     <w:p>
@@ -256,6 +359,13 @@
         </w:rPr>
         <w:t xml:space="preserve">Observed Behavior: </w:t>
       </w:r>
+      <w:r>
+        <w:rPr>
+          <w:sz w:val="28"/>
+          <w:szCs w:val="28"/>
+        </w:rPr>
+        <w:t>Same as expected behavior</w:t>
+      </w:r>
     </w:p>
     <w:p>
       <w:pPr>
@@ -277,9 +387,38 @@
       <w:pPr>
         <w:pStyle w:val="Heading2"/>
       </w:pPr>
+      <w:proofErr w:type="spellStart"/>
       <w:r>
         <w:lastRenderedPageBreak/>
-        <w:t>setState(self, clickedCellRow: int, clickedCelCol: int, isFlagging: bool = False)</w:t>
+        <w:t>setState</w:t>
+      </w:r>
+      <w:proofErr w:type="spellEnd"/>
+      <w:r>
+        <w:t xml:space="preserve">(self, </w:t>
+      </w:r>
+      <w:proofErr w:type="spellStart"/>
+      <w:r>
+        <w:t>clickedCellRow</w:t>
+      </w:r>
+      <w:proofErr w:type="spellEnd"/>
+      <w:r>
+        <w:t xml:space="preserve">: int, </w:t>
+      </w:r>
+      <w:proofErr w:type="spellStart"/>
+      <w:r>
+        <w:t>clickedCelCol</w:t>
+      </w:r>
+      <w:proofErr w:type="spellEnd"/>
+      <w:r>
+        <w:t xml:space="preserve">: int, </w:t>
+      </w:r>
+      <w:proofErr w:type="spellStart"/>
+      <w:r>
+        <w:t>isFlagging</w:t>
+      </w:r>
+      <w:proofErr w:type="spellEnd"/>
+      <w:r>
+        <w:t>: bool = False)</w:t>
       </w:r>
     </w:p>
     <w:p>
@@ -426,6 +565,20 @@
         </w:rPr>
         <w:t>Observed Behavior:</w:t>
       </w:r>
+      <w:r>
+        <w:rPr>
+          <w:sz w:val="28"/>
+          <w:szCs w:val="28"/>
+        </w:rPr>
+        <w:t xml:space="preserve"> </w:t>
+      </w:r>
+      <w:r>
+        <w:rPr>
+          <w:sz w:val="28"/>
+          <w:szCs w:val="28"/>
+        </w:rPr>
+        <w:t>Same as expected behavior</w:t>
+      </w:r>
     </w:p>
     <w:p>
       <w:pPr>
@@ -506,6 +659,20 @@
         </w:rPr>
         <w:t>Observed Behavior:</w:t>
       </w:r>
+      <w:r>
+        <w:rPr>
+          <w:sz w:val="28"/>
+          <w:szCs w:val="28"/>
+        </w:rPr>
+        <w:t xml:space="preserve"> </w:t>
+      </w:r>
+      <w:r>
+        <w:rPr>
+          <w:sz w:val="28"/>
+          <w:szCs w:val="28"/>
+        </w:rPr>
+        <w:t>Same as expected behavior</w:t>
+      </w:r>
     </w:p>
     <w:p>
       <w:pPr>
@@ -586,6 +753,20 @@
         </w:rPr>
         <w:t>Observed Behavior:</w:t>
       </w:r>
+      <w:r>
+        <w:rPr>
+          <w:sz w:val="28"/>
+          <w:szCs w:val="28"/>
+        </w:rPr>
+        <w:t xml:space="preserve"> </w:t>
+      </w:r>
+      <w:r>
+        <w:rPr>
+          <w:sz w:val="28"/>
+          <w:szCs w:val="28"/>
+        </w:rPr>
+        <w:t>Same as expected behavior</w:t>
+      </w:r>
     </w:p>
     <w:p>
       <w:pPr>
@@ -666,6 +847,20 @@
         </w:rPr>
         <w:t>Observed Behavior:</w:t>
       </w:r>
+      <w:r>
+        <w:rPr>
+          <w:sz w:val="28"/>
+          <w:szCs w:val="28"/>
+        </w:rPr>
+        <w:t xml:space="preserve"> </w:t>
+      </w:r>
+      <w:r>
+        <w:rPr>
+          <w:sz w:val="28"/>
+          <w:szCs w:val="28"/>
+        </w:rPr>
+        <w:t>Same as expected behavior</w:t>
+      </w:r>
     </w:p>
     <w:p>
       <w:pPr>
@@ -719,12 +914,21 @@
           <w:szCs w:val="28"/>
         </w:rPr>
       </w:pPr>
-      <w:r>
-        <w:rPr>
-          <w:sz w:val="28"/>
-          <w:szCs w:val="28"/>
-        </w:rPr>
-        <w:t>gameState is updated to be set to -1, indicative of a game over and thus soon-to-be end of program.</w:t>
+      <w:proofErr w:type="spellStart"/>
+      <w:r>
+        <w:rPr>
+          <w:sz w:val="28"/>
+          <w:szCs w:val="28"/>
+        </w:rPr>
+        <w:t>gameState</w:t>
+      </w:r>
+      <w:proofErr w:type="spellEnd"/>
+      <w:r>
+        <w:rPr>
+          <w:sz w:val="28"/>
+          <w:szCs w:val="28"/>
+        </w:rPr>
+        <w:t xml:space="preserve"> is updated to be set to -1, indicative of a game over and thus soon-to-be end of program.</w:t>
       </w:r>
     </w:p>
     <w:p>
@@ -746,6 +950,20 @@
         </w:rPr>
         <w:t>Observed Behavior:</w:t>
       </w:r>
+      <w:r>
+        <w:rPr>
+          <w:sz w:val="28"/>
+          <w:szCs w:val="28"/>
+        </w:rPr>
+        <w:t xml:space="preserve"> </w:t>
+      </w:r>
+      <w:r>
+        <w:rPr>
+          <w:sz w:val="28"/>
+          <w:szCs w:val="28"/>
+        </w:rPr>
+        <w:t>Same as expected behavior</w:t>
+      </w:r>
     </w:p>
     <w:p>
       <w:pPr>
@@ -799,13 +1017,22 @@
           <w:szCs w:val="28"/>
         </w:rPr>
       </w:pPr>
+      <w:proofErr w:type="spellStart"/>
       <w:r>
         <w:rPr>
           <w:sz w:val="28"/>
           <w:szCs w:val="28"/>
         </w:rPr>
         <w:lastRenderedPageBreak/>
-        <w:t>numBombNeighbors is called with the cell’s row and column as parameters, the return value is obtained.</w:t>
+        <w:t>numBombNeighbors</w:t>
+      </w:r>
+      <w:proofErr w:type="spellEnd"/>
+      <w:r>
+        <w:rPr>
+          <w:sz w:val="28"/>
+          <w:szCs w:val="28"/>
+        </w:rPr>
+        <w:t xml:space="preserve"> is called with the cell’s row and column as parameters, the return value is obtained.</w:t>
       </w:r>
     </w:p>
     <w:p>
@@ -832,7 +1059,23 @@
           <w:sz w:val="28"/>
           <w:szCs w:val="28"/>
         </w:rPr>
-        <w:t>all neighboring cells that have a value of 0 should be cleared by a nested for loop of setState() calls</w:t>
+        <w:t xml:space="preserve">all neighboring cells that have a value of 0 should be cleared by a nested for loop of </w:t>
+      </w:r>
+      <w:proofErr w:type="spellStart"/>
+      <w:r>
+        <w:rPr>
+          <w:sz w:val="28"/>
+          <w:szCs w:val="28"/>
+        </w:rPr>
+        <w:t>setState</w:t>
+      </w:r>
+      <w:proofErr w:type="spellEnd"/>
+      <w:r>
+        <w:rPr>
+          <w:sz w:val="28"/>
+          <w:szCs w:val="28"/>
+        </w:rPr>
+        <w:t>() calls</w:t>
       </w:r>
     </w:p>
     <w:p>
@@ -854,6 +1097,20 @@
         </w:rPr>
         <w:t>Observed Behavior:</w:t>
       </w:r>
+      <w:r>
+        <w:rPr>
+          <w:sz w:val="28"/>
+          <w:szCs w:val="28"/>
+        </w:rPr>
+        <w:t xml:space="preserve"> </w:t>
+      </w:r>
+      <w:r>
+        <w:rPr>
+          <w:sz w:val="28"/>
+          <w:szCs w:val="28"/>
+        </w:rPr>
+        <w:t>Same as expected behavior</w:t>
+      </w:r>
     </w:p>
     <w:p>
       <w:pPr>
@@ -868,7 +1125,15 @@
         <w:pStyle w:val="Heading2"/>
       </w:pPr>
       <w:r>
-        <w:t>__checkAdjCells(self, row: int, col: int):</w:t>
+        <w:t>__</w:t>
+      </w:r>
+      <w:proofErr w:type="spellStart"/>
+      <w:r>
+        <w:t>checkAdjCells</w:t>
+      </w:r>
+      <w:proofErr w:type="spellEnd"/>
+      <w:r>
+        <w:t>(self, row: int, col: int):</w:t>
       </w:r>
     </w:p>
     <w:p>
@@ -966,7 +1231,23 @@
           <w:sz w:val="28"/>
           <w:szCs w:val="28"/>
         </w:rPr>
-        <w:t>Calls getCellState() on all of the found cells adjacent</w:t>
+        <w:t xml:space="preserve">Calls </w:t>
+      </w:r>
+      <w:proofErr w:type="spellStart"/>
+      <w:r>
+        <w:rPr>
+          <w:sz w:val="28"/>
+          <w:szCs w:val="28"/>
+        </w:rPr>
+        <w:t>getCellState</w:t>
+      </w:r>
+      <w:proofErr w:type="spellEnd"/>
+      <w:r>
+        <w:rPr>
+          <w:sz w:val="28"/>
+          <w:szCs w:val="28"/>
+        </w:rPr>
+        <w:t>() on all of the found cells adjacent</w:t>
       </w:r>
     </w:p>
     <w:p>
@@ -1046,7 +1327,23 @@
           <w:sz w:val="28"/>
           <w:szCs w:val="28"/>
         </w:rPr>
-        <w:t>Calls getCellState() on all of the found cells adjacent</w:t>
+        <w:t xml:space="preserve">Calls </w:t>
+      </w:r>
+      <w:proofErr w:type="spellStart"/>
+      <w:r>
+        <w:rPr>
+          <w:sz w:val="28"/>
+          <w:szCs w:val="28"/>
+        </w:rPr>
+        <w:t>getCellState</w:t>
+      </w:r>
+      <w:proofErr w:type="spellEnd"/>
+      <w:r>
+        <w:rPr>
+          <w:sz w:val="28"/>
+          <w:szCs w:val="28"/>
+        </w:rPr>
+        <w:t>() on all of the found cells adjacent</w:t>
       </w:r>
     </w:p>
     <w:p>
@@ -1126,7 +1423,23 @@
           <w:sz w:val="28"/>
           <w:szCs w:val="28"/>
         </w:rPr>
-        <w:t>Calls getCellState() on all of the found cells adjacent</w:t>
+        <w:t xml:space="preserve">Calls </w:t>
+      </w:r>
+      <w:proofErr w:type="spellStart"/>
+      <w:r>
+        <w:rPr>
+          <w:sz w:val="28"/>
+          <w:szCs w:val="28"/>
+        </w:rPr>
+        <w:t>getCellState</w:t>
+      </w:r>
+      <w:proofErr w:type="spellEnd"/>
+      <w:r>
+        <w:rPr>
+          <w:sz w:val="28"/>
+          <w:szCs w:val="28"/>
+        </w:rPr>
+        <w:t>() on all of the found cells adjacent</w:t>
       </w:r>
     </w:p>
     <w:p>
@@ -1206,7 +1519,23 @@
           <w:sz w:val="28"/>
           <w:szCs w:val="28"/>
         </w:rPr>
-        <w:t>Calls getCellState() on all of the found cells adjacent</w:t>
+        <w:t xml:space="preserve">Calls </w:t>
+      </w:r>
+      <w:proofErr w:type="spellStart"/>
+      <w:r>
+        <w:rPr>
+          <w:sz w:val="28"/>
+          <w:szCs w:val="28"/>
+        </w:rPr>
+        <w:t>getCellState</w:t>
+      </w:r>
+      <w:proofErr w:type="spellEnd"/>
+      <w:r>
+        <w:rPr>
+          <w:sz w:val="28"/>
+          <w:szCs w:val="28"/>
+        </w:rPr>
+        <w:t>() on all of the found cells adjacent</w:t>
       </w:r>
     </w:p>
     <w:p>
@@ -2291,6 +2620,7 @@
   <w:style w:type="character" w:default="1" w:styleId="DefaultParagraphFont">
     <w:name w:val="Default Paragraph Font"/>
     <w:uiPriority w:val="1"/>
+    <w:semiHidden/>
     <w:unhideWhenUsed/>
   </w:style>
   <w:style w:type="table" w:default="1" w:styleId="TableNormal">

</xml_diff>